<commit_message>
entrega(bruna): pacote com banco processado - ela nao roda o Processador
Decisao de 11/09: a Bruna nao vai rodar o Processador. build_update_bruna_com_banco.py parte do UPDATE_BRUNA conferido e acrescenta DADOS/BANCO/iam_analytics.db (a base dela reprocessada com 3910365; sqlite backup, integrity_check ok, journal DELETE). INTERACOES/ nao viaja: as tratativas dela desde a ultima dobra ficam no .jsonl e o painel as le ao vivo.

Roteiro de 11/09 ajustado: sem o passo do Processador, backup de DADOS\BANCO e INTERACOES obrigatorio (o banco dela e' substituido), aviso de que arquivo depositado apos 08/09 so' entra no proximo processamento.

Co-Authored-By: Claude Opus 5 <noreply@anthropic.com>
</commit_message>
<xml_diff>
--- a/ENTREGA/ROTEIRO_AJUSTES_CVC_IAM_2026-09-11.docx
+++ b/ENTREGA/ROTEIRO_AJUSTES_CVC_IAM_2026-09-11.docx
@@ -105,7 +105,7 @@
           <w:color w:val="7A5B10"/>
           <w:sz w:val="17"/>
         </w:rPr>
-        <w:t>Os números “medidos” deste documento vêm da SUA base: o pacote de 08/09 trouxe o banco e os arquivos de entrada da sua máquina, e reprocessamos aqui com a versão nova. Se você depositou arquivos novos depois de 08/09, os seus números podem diferir um pouco.</w:t>
+        <w:t>Este pacote já leva o banco PROCESSADO — você não precisa rodar o Processador. É a SUA base (a que veio do pacote de 08/09), reprocessada aqui com a versão nova; os números “medidos” deste documento são os que você vai ver. Arquivos que você tenha depositado na ENTRADA depois de 08/09 não estão nele — entram na próxima vez que o Processador rodar.</w:t>
       </w:r>
     </w:p>
     <w:p>
@@ -135,7 +135,7 @@
           <w:color w:val="2C3340"/>
           <w:sz w:val="20"/>
         </w:rPr>
-        <w:t>O mesmo procedimento de 08/09. O passo 3 continua obrigatório: as correções agem na fase de ANÁLISE, e sem rodar o Processador a tela continua com os números da rodada anterior.</w:t>
+        <w:t>Desta vez NÃO é preciso rodar o Processador: o banco já vai processado dentro do pacote. Por isso ele SUBSTITUI o banco atual — faça o backup do passo 2 antes de qualquer coisa.</w:t>
       </w:r>
     </w:p>
     <w:p>
@@ -175,27 +175,7 @@
           <w:color w:val="2C3340"/>
           <w:sz w:val="19"/>
         </w:rPr>
-        <w:t>Extraia o pacote e copie EXECUTAVEIS/ por cima da pasta atual. NÃO apague nem mexa em DADOS/ e INTERACOES/ — é onde ficam o banco e as tratativas que você já registrou.</w:t>
-      </w:r>
-    </w:p>
-    <w:p>
-      <w:pPr>
-        <w:spacing w:after="60"/>
-      </w:pPr>
-      <w:r>
-        <w:rPr>
-          <w:b/>
-          <w:color w:val="1F2D5C"/>
-          <w:sz w:val="21"/>
-        </w:rPr>
-        <w:t xml:space="preserve">2b.  </w:t>
-      </w:r>
-      <w:r>
-        <w:rPr>
-          <w:color w:val="2C3340"/>
-          <w:sz w:val="19"/>
-        </w:rPr>
-        <w:t>Copie também a pasta ENTRADA/ do pacote por cima da atual. Ela leva só os dois arquivos de referência de sempre (o de-para do SIG e a matriz do franqueado). Nenhum dado seu é substituído.</w:t>
+        <w:t>BACKUP (obrigatório): copie as pastas DADOS\BANCO e INTERACOES para outro lugar. Se algo não sair como esperado, é só devolvê-las.</w:t>
       </w:r>
     </w:p>
     <w:p>
@@ -215,7 +195,27 @@
           <w:color w:val="2C3340"/>
           <w:sz w:val="19"/>
         </w:rPr>
-        <w:t>Rode o Processador.exe UMA VEZ. Obrigatório.</w:t>
+        <w:t>Extraia o pacote na pasta principal da instalação — a que contém DADOS, ENTRADA e EXECUTAVEIS — e aceite substituir os arquivos. Ele traz EXECUTAVEIS, ENTRADA (os dois arquivos de referência de sempre) e DADOS\BANCO (o banco novo).</w:t>
+      </w:r>
+    </w:p>
+    <w:p>
+      <w:pPr>
+        <w:spacing w:after="60"/>
+      </w:pPr>
+      <w:r>
+        <w:rPr>
+          <w:b/>
+          <w:color w:val="1F2D5C"/>
+          <w:sz w:val="21"/>
+        </w:rPr>
+        <w:t xml:space="preserve">3b.  </w:t>
+      </w:r>
+      <w:r>
+        <w:rPr>
+          <w:color w:val="2C3340"/>
+          <w:sz w:val="19"/>
+        </w:rPr>
+        <w:t>NÃO apague nem mexa na pasta INTERACOES: o pacote não a traz, e é nela que estão as tratativas que você registrou desde 08/09 — elas continuam aparecendo no painel.</w:t>
       </w:r>
     </w:p>
     <w:p>
@@ -235,7 +235,7 @@
           <w:color w:val="2C3340"/>
           <w:sz w:val="19"/>
         </w:rPr>
-        <w:t>Abra o visualizador.exe.</w:t>
+        <w:t>Abra o visualizador.exe. Não rode o Processador.</w:t>
       </w:r>
     </w:p>
     <w:p>
@@ -1397,7 +1397,7 @@
                 <w:color w:val="2C3340"/>
                 <w:sz w:val="18"/>
               </w:rPr>
-              <w:t>Trate uma pendência só de um sistema → rode o Processador → Histórico da pessoa.</w:t>
+              <w:t>Trate uma pendência só de um sistema → na próxima vez que o Processador rodar → Histórico da pessoa.</w:t>
             </w:r>
           </w:p>
         </w:tc>
@@ -1430,7 +1430,7 @@
                 <w:color w:val="1E7B43"/>
                 <w:sz w:val="18"/>
               </w:rPr>
-              <w:t>O marco “Pendência resolvida” aparece no sistema tratado, com o ticket e a data da tratativa.</w:t>
+              <w:t>O marco “Pendência resolvida” aparece no sistema tratado, com o ticket e a data da tratativa. (Na Pendências o Resolvido aparece na hora; o Histórico é atualizado quando o Processador roda.)</w:t>
             </w:r>
           </w:p>
         </w:tc>

</xml_diff>